<commit_message>
docs(intake): drop confusing app-distribution question
11.1 asked "will you launch via web only or do you also need an iOS app?"
which makes no sense — both already exist as standard. Custom white-label
app builds are a separate phase-2 conversation, not a pre-onboarding
question. Also dropped 11.2 (pre-launch all-hands brief) which implies a
service that isn't a defined offering yet. Section 11 is now: admin
dashboard walkthrough, comms owner, dates to avoid.

Regenerated the .docx so the customer-facing download matches.

Co-authored-by: Cursor <cursoragent@cursor.com>
</commit_message>
<xml_diff>
--- a/public/downloads/mind-measure-onboarding-questionnaire.docx
+++ b/public/downloads/mind-measure-onboarding-questionnaire.docx
@@ -5309,7 +5309,7 @@
                 <w:sz w:val="22"/>
                 <w:szCs w:val="22"/>
               </w:rPr>
-              <w:t xml:space="preserve">Will you launch via web only, or do you also need an iOS app?</w:t>
+              <w:t xml:space="preserve">Would you like a 45-minute walkthrough of the admin dashboard for your HR and welfare team before launch?</w:t>
             </w:r>
           </w:p>
         </w:tc>
@@ -5364,7 +5364,7 @@
                 <w:sz w:val="22"/>
                 <w:szCs w:val="22"/>
               </w:rPr>
-              <w:t xml:space="preserve">Would you like a 20-minute pre-launch all-hands brief from Mind Measure? (recorded or live)</w:t>
+              <w:t xml:space="preserve">Who owns internal launch communications at your end? (name and email)</w:t>
             </w:r>
           </w:p>
         </w:tc>
@@ -5419,117 +5419,7 @@
                 <w:sz w:val="22"/>
                 <w:szCs w:val="22"/>
               </w:rPr>
-              <w:t xml:space="preserve">Would you like a 45-minute walkthrough of the admin dashboard for your HR and welfare team?</w:t>
-            </w:r>
-          </w:p>
-        </w:tc>
-        <w:tc>
-          <w:tcPr>
-            <w:tcW w:type="pct" w:w="45%"/>
-            <w:tcBorders>
-              <w:top w:val="single" w:color="CBD5E1" w:sz="4"/>
-              <w:left w:val="single" w:color="CBD5E1" w:sz="4"/>
-              <w:bottom w:val="single" w:color="CBD5E1" w:sz="4"/>
-              <w:right w:val="single" w:color="CBD5E1" w:sz="4"/>
-            </w:tcBorders>
-            <w:shd w:fill="F4F6FA" w:color="auto" w:val="clear"/>
-            <w:tcMar>
-              <w:top w:type="dxa" w:w="120"/>
-              <w:left w:type="dxa" w:w="160"/>
-              <w:bottom w:type="dxa" w:w="120"/>
-              <w:right w:type="dxa" w:w="160"/>
-            </w:tcMar>
-          </w:tcPr>
-          <w:p>
-            <w:r>
-              <w:rPr>
-                <w:sz w:val="22"/>
-                <w:szCs w:val="22"/>
-              </w:rPr>
-              <w:t xml:space="preserve"/>
-            </w:r>
-          </w:p>
-        </w:tc>
-      </w:tr>
-      <w:tr>
-        <w:tc>
-          <w:tcPr>
-            <w:tcW w:type="pct" w:w="55%"/>
-            <w:tcBorders>
-              <w:top w:val="single" w:color="CBD5E1" w:sz="4"/>
-              <w:left w:val="single" w:color="CBD5E1" w:sz="4"/>
-              <w:bottom w:val="single" w:color="CBD5E1" w:sz="4"/>
-              <w:right w:val="single" w:color="CBD5E1" w:sz="4"/>
-            </w:tcBorders>
-            <w:tcMar>
-              <w:top w:type="dxa" w:w="120"/>
-              <w:left w:type="dxa" w:w="160"/>
-              <w:bottom w:type="dxa" w:w="120"/>
-              <w:right w:type="dxa" w:w="160"/>
-            </w:tcMar>
-          </w:tcPr>
-          <w:p>
-            <w:r>
-              <w:rPr>
-                <w:sz w:val="22"/>
-                <w:szCs w:val="22"/>
-              </w:rPr>
-              <w:t xml:space="preserve">Who owns internal launch communications? (name and email)</w:t>
-            </w:r>
-          </w:p>
-        </w:tc>
-        <w:tc>
-          <w:tcPr>
-            <w:tcW w:type="pct" w:w="45%"/>
-            <w:tcBorders>
-              <w:top w:val="single" w:color="CBD5E1" w:sz="4"/>
-              <w:left w:val="single" w:color="CBD5E1" w:sz="4"/>
-              <w:bottom w:val="single" w:color="CBD5E1" w:sz="4"/>
-              <w:right w:val="single" w:color="CBD5E1" w:sz="4"/>
-            </w:tcBorders>
-            <w:shd w:fill="F4F6FA" w:color="auto" w:val="clear"/>
-            <w:tcMar>
-              <w:top w:type="dxa" w:w="120"/>
-              <w:left w:type="dxa" w:w="160"/>
-              <w:bottom w:type="dxa" w:w="120"/>
-              <w:right w:type="dxa" w:w="160"/>
-            </w:tcMar>
-          </w:tcPr>
-          <w:p>
-            <w:r>
-              <w:rPr>
-                <w:sz w:val="22"/>
-                <w:szCs w:val="22"/>
-              </w:rPr>
-              <w:t xml:space="preserve"/>
-            </w:r>
-          </w:p>
-        </w:tc>
-      </w:tr>
-      <w:tr>
-        <w:tc>
-          <w:tcPr>
-            <w:tcW w:type="pct" w:w="55%"/>
-            <w:tcBorders>
-              <w:top w:val="single" w:color="CBD5E1" w:sz="4"/>
-              <w:left w:val="single" w:color="CBD5E1" w:sz="4"/>
-              <w:bottom w:val="single" w:color="CBD5E1" w:sz="4"/>
-              <w:right w:val="single" w:color="CBD5E1" w:sz="4"/>
-            </w:tcBorders>
-            <w:tcMar>
-              <w:top w:type="dxa" w:w="120"/>
-              <w:left w:type="dxa" w:w="160"/>
-              <w:bottom w:type="dxa" w:w="120"/>
-              <w:right w:type="dxa" w:w="160"/>
-            </w:tcMar>
-          </w:tcPr>
-          <w:p>
-            <w:r>
-              <w:rPr>
-                <w:sz w:val="22"/>
-                <w:szCs w:val="22"/>
-              </w:rPr>
-              <w:t xml:space="preserve">Any dates we should avoid for launch? (e.g. peak audit season, Ramadan, year-end close)</w:t>
+              <w:t xml:space="preserve">Any dates we should avoid for launch? (e.g. peak audit season, Ramadan, year-end close, results week)</w:t>
             </w:r>
           </w:p>
         </w:tc>

</xml_diff>

<commit_message>
docs(intake): clarify two-touchpoint framing — native mobile vs web back office
The questionnaire didn't make the product shape clear: employees only
access Mind Measure via the native iOS/Android mobile app (never a
browser); HR and welfare access the back office via web. A few questions
read ambiguously without that context.

- Added a "How Mind Measure works at your organisation" framing block
  near the top of both the MDX page and the .docx that spells out the
  two touchpoints.
- Renamed section 5 from "Signing in to the app" to "Signing in" and
  added a one-line preamble noting both touchpoints are covered.
- Reworded 5.1 to talk about "recognising an employee belongs to your
  organisation when they sign up to the mobile app" rather than "routing
  them to your version of the app" (which implied a web variant).
- Reworded 5.4 SSO so it explicitly covers both mobile app and admin
  dashboard sign-in.

Regenerated the Word doc.

Co-authored-by: Cursor <cursoragent@cursor.com>
</commit_message>
<xml_diff>
--- a/public/downloads/mind-measure-onboarding-questionnaire.docx
+++ b/public/downloads/mind-measure-onboarding-questionnaire.docx
@@ -64,6 +64,70 @@
           <w:szCs w:val="22"/>
         </w:rPr>
         <w:t xml:space="preserve">It should take roughly 30 minutes to complete with the right people in the room — typically HR, with an occasional dip into IT for section 5. Please return the completed document to your Mind Measure account manager. If you are unsure of any answer, leave it blank and we will discuss it at your kick-off call.</w:t>
+      </w:r>
+    </w:p>
+    <w:p>
+      <w:pPr>
+        <w:pStyle w:val="Heading2"/>
+        <w:spacing w:after="160" w:before="360"/>
+      </w:pPr>
+      <w:r>
+        <w:rPr>
+          <w:b/>
+          <w:bCs/>
+          <w:color w:val="2B3A52"/>
+          <w:sz w:val="26"/>
+          <w:szCs w:val="26"/>
+        </w:rPr>
+        <w:t xml:space="preserve">How Mind Measure works at your organisation</w:t>
+      </w:r>
+    </w:p>
+    <w:p>
+      <w:pPr>
+        <w:spacing w:after="120"/>
+      </w:pPr>
+      <w:r>
+        <w:rPr>
+          <w:b w:val="false"/>
+          <w:bCs w:val="false"/>
+          <w:i w:val="false"/>
+          <w:iCs w:val="false"/>
+          <w:sz w:val="22"/>
+          <w:szCs w:val="22"/>
+        </w:rPr>
+        <w:t xml:space="preserve">Mind Measure has two touchpoints, and a few of the questions below relate to each one — so it helps to have this in mind as you go through:</w:t>
+      </w:r>
+    </w:p>
+    <w:p>
+      <w:pPr>
+        <w:spacing w:after="120"/>
+      </w:pPr>
+      <w:r>
+        <w:rPr>
+          <w:b w:val="false"/>
+          <w:bCs w:val="false"/>
+          <w:i w:val="false"/>
+          <w:iCs w:val="false"/>
+          <w:sz w:val="22"/>
+          <w:szCs w:val="22"/>
+        </w:rPr>
+        <w:t xml:space="preserve">  •  The mobile app (iOS and Android — native) is where your employees check in, see their wellbeing scores, and access the support resources you have signed off. Employees do not access Mind Measure through a web browser.</w:t>
+      </w:r>
+    </w:p>
+    <w:p>
+      <w:pPr>
+        <w:spacing w:after="120"/>
+      </w:pPr>
+      <w:r>
+        <w:rPr>
+          <w:b w:val="false"/>
+          <w:bCs w:val="false"/>
+          <w:i w:val="false"/>
+          <w:iCs w:val="false"/>
+          <w:sz w:val="22"/>
+          <w:szCs w:val="22"/>
+        </w:rPr>
+        <w:t xml:space="preserve">  •  The admin dashboard (web) is where your HR and welfare team view anonymised, aggregated results, manage cohort analysis, and run reports. Only your nominated welfare and HR contacts have access.</w:t>
       </w:r>
     </w:p>
     <w:p>
@@ -2898,23 +2962,7 @@
           <w:sz w:val="32"/>
           <w:szCs w:val="32"/>
         </w:rPr>
-        <w:t xml:space="preserve">5. Signing in to the app</w:t>
-      </w:r>
-    </w:p>
-    <w:p>
-      <w:pPr>
-        <w:pStyle w:val="Heading2"/>
-        <w:spacing w:after="160" w:before="360"/>
-      </w:pPr>
-      <w:r>
-        <w:rPr>
-          <w:b/>
-          <w:bCs/>
-          <w:color w:val="2B3A52"/>
-          <w:sz w:val="26"/>
-          <w:szCs w:val="26"/>
-        </w:rPr>
-        <w:t xml:space="preserve">5.1 Which email domains identify your employees?</w:t>
+        <w:t xml:space="preserve">5. Signing in</w:t>
       </w:r>
     </w:p>
     <w:p>
@@ -2930,7 +2978,39 @@
           <w:sz w:val="22"/>
           <w:szCs w:val="22"/>
         </w:rPr>
-        <w:t xml:space="preserve">Mind Measure uses email domain to route employees to your version of the app when they sign up. List every domain that belongs to your organisation.</w:t>
+        <w:t xml:space="preserve">Employees sign in to the mobile app; your HR and welfare team sign in to the web admin dashboard. The questions below cover both.</w:t>
+      </w:r>
+    </w:p>
+    <w:p>
+      <w:pPr>
+        <w:pStyle w:val="Heading2"/>
+        <w:spacing w:after="160" w:before="360"/>
+      </w:pPr>
+      <w:r>
+        <w:rPr>
+          <w:b/>
+          <w:bCs/>
+          <w:color w:val="2B3A52"/>
+          <w:sz w:val="26"/>
+          <w:szCs w:val="26"/>
+        </w:rPr>
+        <w:t xml:space="preserve">5.1 Which email domains identify your employees?</w:t>
+      </w:r>
+    </w:p>
+    <w:p>
+      <w:pPr>
+        <w:spacing w:after="120"/>
+      </w:pPr>
+      <w:r>
+        <w:rPr>
+          <w:b w:val="false"/>
+          <w:bCs w:val="false"/>
+          <w:i w:val="false"/>
+          <w:iCs w:val="false"/>
+          <w:sz w:val="22"/>
+          <w:szCs w:val="22"/>
+        </w:rPr>
+        <w:t xml:space="preserve">Mind Measure uses email domain to recognise an employee belongs to your organisation when they sign up to the mobile app. List every domain that belongs to you.</w:t>
       </w:r>
     </w:p>
     <w:tbl>
@@ -3147,7 +3227,7 @@
           <w:sz w:val="22"/>
           <w:szCs w:val="22"/>
         </w:rPr>
-        <w:t xml:space="preserve">If yes, tell us which provider (Microsoft Azure AD / Entra ID, Okta, Google Workspace, etc.) and whether you have a preferred timeline for switching it on. SSO is not required for the pilot but most organisations enable it for full rollout.</w:t>
+        <w:t xml:space="preserve">SSO can apply to the mobile app, the admin dashboard, or both. If you require it, tell us which provider (Microsoft Azure AD / Entra ID, Okta, Google Workspace, etc.) and whether you have a preferred timeline for switching it on. SSO is not required for the pilot, but most organisations enable it before full rollout.</w:t>
       </w:r>
     </w:p>
     <w:tbl>

</xml_diff>

<commit_message>
docs: strip dashes, clarify native-only employee access, pointer rules
- platform-handbook: add explicit End-user touchpoints note (students
  and employees use native iOS / Android only; mobile.* domains host
  the OTA bundle, never the customer surface). Mobile table rows now
  say "native mobile app (iOS, Android)".
- company-intake (.mdx and .docx): all em-dashes and en-dashes removed.
- company-intake-internal: same purge across mapping tables and import
  steps.
- generate-intake-docx: same purge; docx regenerated.

No commit message or body uses dashes either.

Co-authored-by: Cursor <cursoragent@cursor.com>
</commit_message>
<xml_diff>
--- a/public/downloads/mind-measure-onboarding-questionnaire.docx
+++ b/public/downloads/mind-measure-onboarding-questionnaire.docx
@@ -63,7 +63,7 @@
           <w:sz w:val="22"/>
           <w:szCs w:val="22"/>
         </w:rPr>
-        <w:t xml:space="preserve">It should take roughly 30 minutes to complete with the right people in the room — typically HR, with an occasional dip into IT for section 5. Please return the completed document to your Mind Measure account manager. If you are unsure of any answer, leave it blank and we will discuss it at your kick-off call.</w:t>
+        <w:t xml:space="preserve">It should take roughly 30 minutes to complete with the right people in the room (typically HR, with an occasional dip into IT for section 5). Please return the completed document to your Mind Measure account manager. If you are unsure of any answer, leave it blank and we will discuss it at your kick-off call.</w:t>
       </w:r>
     </w:p>
     <w:p>
@@ -95,7 +95,7 @@
           <w:sz w:val="22"/>
           <w:szCs w:val="22"/>
         </w:rPr>
-        <w:t xml:space="preserve">Mind Measure has two touchpoints, and a few of the questions below relate to each one — so it helps to have this in mind as you go through:</w:t>
+        <w:t xml:space="preserve">Mind Measure has two touchpoints, and a few of the questions below relate to each one, so it helps to have this in mind as you go through:</w:t>
       </w:r>
     </w:p>
     <w:p>
@@ -111,7 +111,7 @@
           <w:sz w:val="22"/>
           <w:szCs w:val="22"/>
         </w:rPr>
-        <w:t xml:space="preserve">  •  The mobile app (iOS and Android — native) is where your employees check in, see their wellbeing scores, and access the support resources you have signed off. Employees do not access Mind Measure through a web browser.</w:t>
+        <w:t xml:space="preserve">  •  The mobile app (native iOS and Android) is where your employees check in, see their wellbeing scores, and access the support resources you have signed off. Employees do not access Mind Measure through a web browser.</w:t>
       </w:r>
     </w:p>
     <w:p>
@@ -1887,7 +1887,7 @@
           <w:sz w:val="22"/>
           <w:szCs w:val="22"/>
         </w:rPr>
-        <w:t xml:space="preserve">A list of trained MHFAs at your organisation. We can surface them in the in-app Help screen. List as many as you would like — name, best way to contact them (email or chat), and any office or team they cover.</w:t>
+        <w:t xml:space="preserve">A list of trained MHFAs at your organisation. We can surface them in the in-app Help screen. List as many as you would like, with name, best way to contact them (email or chat), and any office or team they cover.</w:t>
       </w:r>
     </w:p>
     <w:tbl>
@@ -1932,7 +1932,7 @@
                 <w:sz w:val="20"/>
                 <w:szCs w:val="20"/>
               </w:rPr>
-              <w:t xml:space="preserve">e.g. "Sarah Khan, sarah.khan@example.com — Dubai office, all teams"</w:t>
+              <w:t xml:space="preserve">e.g. "Sarah Khan, sarah.khan@example.com, Dubai office, all teams"</w:t>
             </w:r>
           </w:p>
         </w:tc>
@@ -2052,7 +2052,7 @@
                 <w:sz w:val="20"/>
                 <w:szCs w:val="20"/>
               </w:rPr>
-              <w:t xml:space="preserve">e.g. "Consulting — 1,400 people — Strategy &amp; Operations, Technology Consulting, People &amp; Organisation, Risk Consulting"</w:t>
+              <w:t xml:space="preserve">e.g. "Consulting, 1,400 people. Practices: Strategy &amp; Operations, Technology Consulting, People &amp; Organisation, Risk Consulting"</w:t>
             </w:r>
           </w:p>
         </w:tc>
@@ -2137,7 +2137,7 @@
                 <w:sz w:val="20"/>
                 <w:szCs w:val="20"/>
               </w:rPr>
-              <w:t xml:space="preserve">e.g. "Emaar Square, Dubai — UAE — 1,400 employees"</w:t>
+              <w:t xml:space="preserve">e.g. "Emaar Square, Dubai, UAE, 1,400 employees"</w:t>
             </w:r>
           </w:p>
         </w:tc>
@@ -3304,7 +3304,7 @@
           <w:sz w:val="22"/>
           <w:szCs w:val="22"/>
         </w:rPr>
-        <w:t xml:space="preserve">This section is the most important. Mind Measure is designed to route employees back into the support you already provide — never to replace it. Tell us what is already in place so we can build it into the app.</w:t>
+        <w:t xml:space="preserve">This section is the most important. Mind Measure is designed to route employees back into the support you already provide, never to replace it. Tell us what is already in place so we can build it into the app.</w:t>
       </w:r>
     </w:p>
     <w:p>
@@ -4666,7 +4666,7 @@
           <w:sz w:val="22"/>
           <w:szCs w:val="22"/>
         </w:rPr>
-        <w:t xml:space="preserve">Mind Measure's voice agent — Jodie — runs the daily check-in. She can ask a small number of questions that are specific to your organisation, so we can track sentiment on issues you care about. Examples:</w:t>
+        <w:t xml:space="preserve">Mind Measure's voice agent, Jodie, runs the daily check-in. She can ask a small number of questions that are specific to your organisation, so we can track sentiment on issues you care about. Examples:</w:t>
       </w:r>
     </w:p>
     <w:p>
@@ -4953,7 +4953,7 @@
                 <w:sz w:val="22"/>
                 <w:szCs w:val="22"/>
               </w:rPr>
-              <w:t xml:space="preserve">Minimum cohort size before scores are shown (we recommend 5 — never lower)</w:t>
+              <w:t xml:space="preserve">Minimum cohort size before scores are shown (we recommend 5, never lower)</w:t>
             </w:r>
           </w:p>
         </w:tc>
@@ -5173,7 +5173,7 @@
                 <w:sz w:val="22"/>
                 <w:szCs w:val="22"/>
               </w:rPr>
-              <w:t xml:space="preserve">Do you need a Data Processing Agreement signed? (Mind Measure can provide a standard DPA — yes/no)</w:t>
+              <w:t xml:space="preserve">Do you need a Data Processing Agreement signed? (Mind Measure can provide a standard DPA, yes/no)</w:t>
             </w:r>
           </w:p>
         </w:tc>
@@ -5569,7 +5569,7 @@
           <w:sz w:val="22"/>
           <w:szCs w:val="22"/>
         </w:rPr>
-        <w:t xml:space="preserve">Anything we have not asked about, anything we should know, anything that makes your organisation a bit different — tell us here.</w:t>
+        <w:t xml:space="preserve">Anything we have not asked about, anything we should know, anything that makes your organisation a bit different, tell us here.</w:t>
       </w:r>
     </w:p>
     <w:tbl>
@@ -5914,7 +5914,7 @@
           <w:sz w:val="22"/>
           <w:szCs w:val="22"/>
         </w:rPr>
-        <w:t xml:space="preserve">— The Mind Measure team</w:t>
+        <w:t xml:space="preserve">The Mind Measure team</w:t>
       </w:r>
     </w:p>
     <w:sectPr>
@@ -6067,7 +6067,7 @@
         <w:sz w:val="18"/>
         <w:szCs w:val="18"/>
       </w:rPr>
-      <w:t xml:space="preserve">Mind Measure — Onboarding Questionnaire</w:t>
+      <w:t xml:space="preserve">Mind Measure: Onboarding Questionnaire</w:t>
     </w:r>
   </w:p>
 </w:hdr>

</xml_diff>